<commit_message>
Rebuilt 9th grade module 1, L1 contents.
</commit_message>
<xml_diff>
--- a/Grade_9/Semester_1/01_Safety/002_L - Privacy & account safety/Teacher_Plan.docx
+++ b/Grade_9/Semester_1/01_Safety/002_L - Privacy & account safety/Teacher_Plan.docx
@@ -30,10 +30,10 @@
       <w:tblPr>
         <w:tblW w:type="auto" w:w="100"/>
         <w:tblBorders>
-          <w:top w:val="none" w:color="FFFFFF" w:sz="0"/>
-          <w:left w:val="none" w:color="FFFFFF" w:sz="0"/>
-          <w:bottom w:val="none" w:color="FFFFFF" w:sz="0"/>
-          <w:right w:val="none" w:color="FFFFFF" w:sz="0"/>
+          <w:top w:val="none" w:sz="0"/>
+          <w:left w:val="none" w:sz="0"/>
+          <w:bottom w:val="none" w:sz="0"/>
+          <w:right w:val="none" w:sz="0"/>
           <w:insideH w:val="single" w:color="auto" w:sz="4"/>
           <w:insideV w:val="single" w:color="auto" w:sz="4"/>
         </w:tblBorders>
@@ -48,10 +48,10 @@
           <w:tcPr>
             <w:tcW w:type="dxa" w:w="2400"/>
             <w:tcBorders>
-              <w:top w:val="none" w:color="FFFFFF" w:sz="0"/>
-              <w:left w:val="none" w:color="FFFFFF" w:sz="0"/>
+              <w:top w:val="none" w:sz="0"/>
+              <w:left w:val="none" w:sz="0"/>
               <w:bottom w:val="single" w:color="EEEEEE" w:sz="4"/>
-              <w:right w:val="none" w:color="FFFFFF" w:sz="0"/>
+              <w:right w:val="none" w:sz="0"/>
             </w:tcBorders>
             <w:shd w:fill="F8F9FA" w:val="clear"/>
             <w:tcMar>
@@ -79,10 +79,10 @@
           <w:tcPr>
             <w:tcW w:type="dxa" w:w="7200"/>
             <w:tcBorders>
-              <w:top w:val="none" w:color="FFFFFF" w:sz="0"/>
-              <w:left w:val="none" w:color="FFFFFF" w:sz="0"/>
+              <w:top w:val="none" w:sz="0"/>
+              <w:left w:val="none" w:sz="0"/>
               <w:bottom w:val="single" w:color="EEEEEE" w:sz="4"/>
-              <w:right w:val="none" w:color="FFFFFF" w:sz="0"/>
+              <w:right w:val="none" w:sz="0"/>
             </w:tcBorders>
             <w:shd w:fill="F8F9FA" w:val="clear"/>
             <w:tcMar>
@@ -100,7 +100,7 @@
                 <w:sz w:val="22"/>
                 <w:szCs w:val="22"/>
               </w:rPr>
-              <w:t xml:space="preserve">L — Mokymosi pamoka (2 iš 7 apie saugą)</w:t>
+              <w:t xml:space="preserve">L — Mokymosi pamoka (2 iš 4 apie saugą)</w:t>
             </w:r>
           </w:p>
         </w:tc>
@@ -110,10 +110,10 @@
           <w:tcPr>
             <w:tcW w:type="dxa" w:w="2400"/>
             <w:tcBorders>
-              <w:top w:val="none" w:color="FFFFFF" w:sz="0"/>
-              <w:left w:val="none" w:color="FFFFFF" w:sz="0"/>
+              <w:top w:val="none" w:sz="0"/>
+              <w:left w:val="none" w:sz="0"/>
               <w:bottom w:val="single" w:color="EEEEEE" w:sz="4"/>
-              <w:right w:val="none" w:color="FFFFFF" w:sz="0"/>
+              <w:right w:val="none" w:sz="0"/>
             </w:tcBorders>
             <w:shd w:fill="F8F9FA" w:val="clear"/>
             <w:tcMar>
@@ -141,10 +141,10 @@
           <w:tcPr>
             <w:tcW w:type="dxa" w:w="7200"/>
             <w:tcBorders>
-              <w:top w:val="none" w:color="FFFFFF" w:sz="0"/>
-              <w:left w:val="none" w:color="FFFFFF" w:sz="0"/>
+              <w:top w:val="none" w:sz="0"/>
+              <w:left w:val="none" w:sz="0"/>
               <w:bottom w:val="single" w:color="EEEEEE" w:sz="4"/>
-              <w:right w:val="none" w:color="FFFFFF" w:sz="0"/>
+              <w:right w:val="none" w:sz="0"/>
             </w:tcBorders>
             <w:shd w:fill="F8F9FA" w:val="clear"/>
             <w:tcMar>
@@ -172,10 +172,10 @@
           <w:tcPr>
             <w:tcW w:type="dxa" w:w="2400"/>
             <w:tcBorders>
-              <w:top w:val="none" w:color="FFFFFF" w:sz="0"/>
-              <w:left w:val="none" w:color="FFFFFF" w:sz="0"/>
+              <w:top w:val="none" w:sz="0"/>
+              <w:left w:val="none" w:sz="0"/>
               <w:bottom w:val="single" w:color="EEEEEE" w:sz="4"/>
-              <w:right w:val="none" w:color="FFFFFF" w:sz="0"/>
+              <w:right w:val="none" w:sz="0"/>
             </w:tcBorders>
             <w:shd w:fill="F8F9FA" w:val="clear"/>
             <w:tcMar>
@@ -203,10 +203,10 @@
           <w:tcPr>
             <w:tcW w:type="dxa" w:w="7200"/>
             <w:tcBorders>
-              <w:top w:val="none" w:color="FFFFFF" w:sz="0"/>
-              <w:left w:val="none" w:color="FFFFFF" w:sz="0"/>
+              <w:top w:val="none" w:sz="0"/>
+              <w:left w:val="none" w:sz="0"/>
               <w:bottom w:val="single" w:color="EEEEEE" w:sz="4"/>
-              <w:right w:val="none" w:color="FFFFFF" w:sz="0"/>
+              <w:right w:val="none" w:sz="0"/>
             </w:tcBorders>
             <w:shd w:fill="F8F9FA" w:val="clear"/>
             <w:tcMar>
@@ -234,10 +234,10 @@
           <w:tcPr>
             <w:tcW w:type="dxa" w:w="2400"/>
             <w:tcBorders>
-              <w:top w:val="none" w:color="FFFFFF" w:sz="0"/>
-              <w:left w:val="none" w:color="FFFFFF" w:sz="0"/>
+              <w:top w:val="none" w:sz="0"/>
+              <w:left w:val="none" w:sz="0"/>
               <w:bottom w:val="single" w:color="EEEEEE" w:sz="4"/>
-              <w:right w:val="none" w:color="FFFFFF" w:sz="0"/>
+              <w:right w:val="none" w:sz="0"/>
             </w:tcBorders>
             <w:shd w:fill="F8F9FA" w:val="clear"/>
             <w:tcMar>
@@ -265,10 +265,10 @@
           <w:tcPr>
             <w:tcW w:type="dxa" w:w="7200"/>
             <w:tcBorders>
-              <w:top w:val="none" w:color="FFFFFF" w:sz="0"/>
-              <w:left w:val="none" w:color="FFFFFF" w:sz="0"/>
+              <w:top w:val="none" w:sz="0"/>
+              <w:left w:val="none" w:sz="0"/>
               <w:bottom w:val="single" w:color="EEEEEE" w:sz="4"/>
-              <w:right w:val="none" w:color="FFFFFF" w:sz="0"/>
+              <w:right w:val="none" w:sz="0"/>
             </w:tcBorders>
             <w:shd w:fill="F8F9FA" w:val="clear"/>
             <w:tcMar>
@@ -286,7 +286,7 @@
                 <w:sz w:val="22"/>
                 <w:szCs w:val="22"/>
               </w:rPr>
-              <w:t xml:space="preserve">Demo → bandymas</w:t>
+              <w:t xml:space="preserve">Pilnas demonstravimas</w:t>
             </w:r>
           </w:p>
         </w:tc>
@@ -296,10 +296,10 @@
           <w:tcPr>
             <w:tcW w:type="dxa" w:w="2400"/>
             <w:tcBorders>
-              <w:top w:val="none" w:color="FFFFFF" w:sz="0"/>
-              <w:left w:val="none" w:color="FFFFFF" w:sz="0"/>
+              <w:top w:val="none" w:sz="0"/>
+              <w:left w:val="none" w:sz="0"/>
               <w:bottom w:val="single" w:color="EEEEEE" w:sz="4"/>
-              <w:right w:val="none" w:color="FFFFFF" w:sz="0"/>
+              <w:right w:val="none" w:sz="0"/>
             </w:tcBorders>
             <w:shd w:fill="F8F9FA" w:val="clear"/>
             <w:tcMar>
@@ -327,10 +327,10 @@
           <w:tcPr>
             <w:tcW w:type="dxa" w:w="7200"/>
             <w:tcBorders>
-              <w:top w:val="none" w:color="FFFFFF" w:sz="0"/>
-              <w:left w:val="none" w:color="FFFFFF" w:sz="0"/>
+              <w:top w:val="none" w:sz="0"/>
+              <w:left w:val="none" w:sz="0"/>
               <w:bottom w:val="single" w:color="EEEEEE" w:sz="4"/>
-              <w:right w:val="none" w:color="FFFFFF" w:sz="0"/>
+              <w:right w:val="none" w:sz="0"/>
             </w:tcBorders>
             <w:shd w:fill="F8F9FA" w:val="clear"/>
             <w:tcMar>
@@ -348,7 +348,7 @@
                 <w:sz w:val="22"/>
                 <w:szCs w:val="22"/>
               </w:rPr>
-              <w:t xml:space="preserve">Ši pamoka apima stiprių slaptažodžių kūrimą, dviejų veiksnių autentifikacijos (2FA) logiką ir jautrių asmeninių duomenų atpažinimą. Neapima internetinių grėsmių (phishing), aplinkos poveikio ar ergonomikos.</w:t>
+              <w:t xml:space="preserve">Ši pamoka apima stiprių slaptažodžių kūrimo kriterijus, dviejų veiksnių autentifikacijos (2FA) veikimo principą ir jautrių asmeninių duomenų atpažinimą konkrečiose situacijose. Neapima phishing, socialinės inžinerijos ar internetinių grėsmių, tai nagrinėjama kitoje pamokoje.</w:t>
             </w:r>
           </w:p>
         </w:tc>
@@ -463,7 +463,7 @@
           </w:p>
           <w:p>
             <w:pPr>
-              <w:spacing w:after="0"/>
+              <w:spacing w:after="60"/>
             </w:pPr>
             <w:r>
               <w:rPr>
@@ -498,10 +498,10 @@
       <w:tblPr>
         <w:tblW w:type="auto" w:w="100"/>
         <w:tblBorders>
-          <w:top w:val="none" w:color="FFFFFF" w:sz="0"/>
-          <w:left w:val="none" w:color="FFFFFF" w:sz="0"/>
-          <w:bottom w:val="none" w:color="FFFFFF" w:sz="0"/>
-          <w:right w:val="none" w:color="FFFFFF" w:sz="0"/>
+          <w:top w:val="none" w:sz="0"/>
+          <w:left w:val="none" w:sz="0"/>
+          <w:bottom w:val="none" w:sz="0"/>
+          <w:right w:val="none" w:sz="0"/>
           <w:insideH w:val="single" w:color="auto" w:sz="4"/>
           <w:insideV w:val="single" w:color="auto" w:sz="4"/>
         </w:tblBorders>
@@ -518,6 +518,12 @@
         <w:tc>
           <w:tcPr>
             <w:tcW w:type="dxa" w:w="200"/>
+            <w:tcBorders>
+              <w:top w:val="none" w:sz="0"/>
+              <w:left w:val="none" w:sz="0"/>
+              <w:bottom w:val="none" w:sz="0"/>
+              <w:right w:val="none" w:sz="0"/>
+            </w:tcBorders>
             <w:shd w:fill="F57C00" w:val="clear"/>
           </w:tcPr>
           <w:p/>
@@ -525,6 +531,12 @@
         <w:tc>
           <w:tcPr>
             <w:tcW w:type="dxa" w:w="9400"/>
+            <w:tcBorders>
+              <w:top w:val="none" w:sz="0"/>
+              <w:left w:val="none" w:sz="0"/>
+              <w:bottom w:val="none" w:sz="0"/>
+              <w:right w:val="none" w:sz="0"/>
+            </w:tcBorders>
             <w:shd w:fill="FFF3E0" w:val="clear"/>
           </w:tcPr>
           <w:p>
@@ -575,29 +587,11 @@
           <w:sz w:val="22"/>
           <w:szCs w:val="22"/>
         </w:rPr>
-        <w:t xml:space="preserve">žodinis. Klausimai skaidrėje.</w:t>
-      </w:r>
-    </w:p>
-    <w:p>
-      <w:pPr>
-        <w:keepNext/>
-        <w:spacing w:after="80"/>
-      </w:pPr>
-      <w:r>
-        <w:rPr>
-          <w:rFonts w:ascii="Arial" w:cs="Arial" w:eastAsia="Arial" w:hAnsi="Arial"/>
-          <w:b/>
-          <w:bCs/>
-          <w:color w:val="212121"/>
-          <w:sz w:val="22"/>
-          <w:szCs w:val="22"/>
-        </w:rPr>
-        <w:t xml:space="preserve">Klausimai iš praėjusios pamokos (ergonomika):</w:t>
-      </w:r>
-    </w:p>
-    <w:p>
-      <w:pPr>
-        <w:keepNext/>
+        <w:t xml:space="preserve">žodinis, klausimai skaidrėje.</w:t>
+      </w:r>
+    </w:p>
+    <w:p>
+      <w:pPr>
         <w:spacing w:after="60"/>
         <w:ind w:left="360"/>
       </w:pPr>
@@ -619,12 +613,11 @@
           <w:sz w:val="22"/>
           <w:szCs w:val="22"/>
         </w:rPr>
-        <w:t xml:space="preserve">Kokia turėtų būti sėdėjimo laikysena prie kompiuterio? Įvardinkite 2 taisykles.</w:t>
-      </w:r>
-    </w:p>
-    <w:p>
-      <w:pPr>
-        <w:keepNext/>
+        <w:t xml:space="preserve">Kaip reikėtų taisyklingai sėdėti prie kompiuterio? Įvardinkite bent du principus.</w:t>
+      </w:r>
+    </w:p>
+    <w:p>
+      <w:pPr>
         <w:spacing w:after="60"/>
         <w:ind w:left="360"/>
       </w:pPr>
@@ -646,12 +639,11 @@
           <w:sz w:val="22"/>
           <w:szCs w:val="22"/>
         </w:rPr>
-        <w:t xml:space="preserve">Ką reiškia 20-20-20 taisyklė?</w:t>
-      </w:r>
-    </w:p>
-    <w:p>
-      <w:pPr>
-        <w:keepNext/>
+        <w:t xml:space="preserve">Kas yra 20-20-20 taisyklė ir kodėl ji padeda akims?</w:t>
+      </w:r>
+    </w:p>
+    <w:p>
+      <w:pPr>
         <w:spacing w:after="60"/>
         <w:ind w:left="360"/>
       </w:pPr>
@@ -673,12 +665,11 @@
           <w:sz w:val="22"/>
           <w:szCs w:val="22"/>
         </w:rPr>
-        <w:t xml:space="preserve">Kodėl reikia daryti pertraukas, net kai nesijaučia pavargęs?</w:t>
-      </w:r>
-    </w:p>
-    <w:p>
-      <w:pPr>
-        <w:spacing w:after="80"/>
+        <w:t xml:space="preserve">Kokius pratimus galima atlikti per pertrauką, kad sumažintumėte rankų ir nugaros įtampą?</w:t>
+      </w:r>
+    </w:p>
+    <w:p>
+      <w:pPr>
         <w:ind w:left="240"/>
       </w:pPr>
       <w:r>
@@ -690,7 +681,7 @@
           <w:sz w:val="20"/>
           <w:szCs w:val="20"/>
         </w:rPr>
-        <w:t xml:space="preserve">Ryšys: „Praeitą pamoką kalbėjome apie fizinę saugą — šiandien kalbėsime apie skaitmeninę: kaip apsaugoti savo paskyras ir duomenis.“</w:t>
+        <w:t xml:space="preserve">(Ryšys su nauja tema: praeitą pamoką kalbėjome apie fizinę saugą prie kompiuterio. Šiandien pereiname prie skaitmeninės saugos: kaip apsaugoti savo paskyras ir asmeninius duomenis.)</w:t>
       </w:r>
     </w:p>
     <w:p>
@@ -702,10 +693,10 @@
       <w:tblPr>
         <w:tblW w:type="auto" w:w="100"/>
         <w:tblBorders>
-          <w:top w:val="none" w:color="FFFFFF" w:sz="0"/>
-          <w:left w:val="none" w:color="FFFFFF" w:sz="0"/>
-          <w:bottom w:val="none" w:color="FFFFFF" w:sz="0"/>
-          <w:right w:val="none" w:color="FFFFFF" w:sz="0"/>
+          <w:top w:val="none" w:sz="0"/>
+          <w:left w:val="none" w:sz="0"/>
+          <w:bottom w:val="none" w:sz="0"/>
+          <w:right w:val="none" w:sz="0"/>
           <w:insideH w:val="single" w:color="auto" w:sz="4"/>
           <w:insideV w:val="single" w:color="auto" w:sz="4"/>
         </w:tblBorders>
@@ -722,6 +713,12 @@
         <w:tc>
           <w:tcPr>
             <w:tcW w:type="dxa" w:w="200"/>
+            <w:tcBorders>
+              <w:top w:val="none" w:sz="0"/>
+              <w:left w:val="none" w:sz="0"/>
+              <w:bottom w:val="none" w:sz="0"/>
+              <w:right w:val="none" w:sz="0"/>
+            </w:tcBorders>
             <w:shd w:fill="1565C0" w:val="clear"/>
           </w:tcPr>
           <w:p/>
@@ -729,6 +726,12 @@
         <w:tc>
           <w:tcPr>
             <w:tcW w:type="dxa" w:w="9400"/>
+            <w:tcBorders>
+              <w:top w:val="none" w:sz="0"/>
+              <w:left w:val="none" w:sz="0"/>
+              <w:bottom w:val="none" w:sz="0"/>
+              <w:right w:val="none" w:sz="0"/>
+            </w:tcBorders>
             <w:shd w:fill="E3F2FD" w:val="clear"/>
           </w:tcPr>
           <w:p>
@@ -766,44 +769,50 @@
           <w:rFonts w:ascii="Arial" w:cs="Arial" w:eastAsia="Arial" w:hAnsi="Arial"/>
           <w:b/>
           <w:bCs/>
-          <w:color w:val="1565C0"/>
-          <w:sz w:val="22"/>
-          <w:szCs w:val="22"/>
-        </w:rPr>
-        <w:t xml:space="preserve">Slaptažodžių sauga — ~10 min.</w:t>
-      </w:r>
-    </w:p>
-    <w:p>
-      <w:pPr>
-        <w:spacing w:after="80"/>
-      </w:pPr>
-      <w:r>
-        <w:rPr>
-          <w:rFonts w:ascii="Arial" w:cs="Arial" w:eastAsia="Arial" w:hAnsi="Arial"/>
-          <w:color w:val="212121"/>
-          <w:sz w:val="22"/>
-          <w:szCs w:val="22"/>
-        </w:rPr>
-        <w:t xml:space="preserve">Parodykite skaidrėje silpnų slaptažodžių pavyzdžius: „123456“, „slaptazodis“, vardas+gimimo metai.</w:t>
-      </w:r>
-    </w:p>
-    <w:p>
-      <w:pPr>
-        <w:spacing w:after="80"/>
-      </w:pPr>
-      <w:r>
-        <w:rPr>
-          <w:rFonts w:ascii="Arial" w:cs="Arial" w:eastAsia="Arial" w:hAnsi="Arial"/>
-          <w:color w:val="212121"/>
-          <w:sz w:val="22"/>
-          <w:szCs w:val="22"/>
-        </w:rPr>
-        <w:t xml:space="preserve">Paaiškinkite stipraus slaptažodžio kriterijus:</w:t>
-      </w:r>
-    </w:p>
-    <w:p>
-      <w:pPr>
-        <w:spacing w:after="80"/>
+          <w:color w:val="424242"/>
+          <w:sz w:val="22"/>
+          <w:szCs w:val="22"/>
+        </w:rPr>
+        <w:t xml:space="preserve">Dėstymo blokas 1: </w:t>
+      </w:r>
+      <w:r>
+        <w:rPr>
+          <w:rFonts w:ascii="Arial" w:cs="Arial" w:eastAsia="Arial" w:hAnsi="Arial"/>
+          <w:color w:val="212121"/>
+          <w:sz w:val="22"/>
+          <w:szCs w:val="22"/>
+        </w:rPr>
+        <w:t xml:space="preserve">Slaptažodžių sauga (~8 min.)</w:t>
+      </w:r>
+    </w:p>
+    <w:p>
+      <w:pPr>
+        <w:spacing w:after="80"/>
+      </w:pPr>
+      <w:r>
+        <w:rPr>
+          <w:rFonts w:ascii="Arial" w:cs="Arial" w:eastAsia="Arial" w:hAnsi="Arial"/>
+          <w:b/>
+          <w:bCs/>
+          <w:color w:val="424242"/>
+          <w:sz w:val="22"/>
+          <w:szCs w:val="22"/>
+        </w:rPr>
+        <w:t xml:space="preserve">Mokytojo veiksmai: </w:t>
+      </w:r>
+      <w:r>
+        <w:rPr>
+          <w:rFonts w:ascii="Arial" w:cs="Arial" w:eastAsia="Arial" w:hAnsi="Arial"/>
+          <w:color w:val="212121"/>
+          <w:sz w:val="22"/>
+          <w:szCs w:val="22"/>
+        </w:rPr>
+        <w:t xml:space="preserve">Paklauskite mokinių: kas, jūsų manymu, yra geras slaptažodis? Surinkite keletą atsakymų. Parodykite skaidrėje du slaptažodžių pavyzdžius: trumpą, nuspėjamą (pvz., „petras123“) ir stiprų (pvz., „M4n0_k!yp3#Ruduo“). Paaiškinkite stipraus slaptažodžio kriterijus:</w:t>
+      </w:r>
+    </w:p>
+    <w:p>
+      <w:pPr>
+        <w:spacing w:after="40"/>
         <w:ind w:left="360"/>
       </w:pPr>
       <w:r>
@@ -813,12 +822,12 @@
           <w:sz w:val="22"/>
           <w:szCs w:val="22"/>
         </w:rPr>
-        <w:t xml:space="preserve">  • ≥12 simbolių</w:t>
-      </w:r>
-    </w:p>
-    <w:p>
-      <w:pPr>
-        <w:spacing w:after="80"/>
+        <w:t xml:space="preserve">• Ilgis: bent 12 simbolių.</w:t>
+      </w:r>
+    </w:p>
+    <w:p>
+      <w:pPr>
+        <w:spacing w:after="40"/>
         <w:ind w:left="360"/>
       </w:pPr>
       <w:r>
@@ -828,12 +837,12 @@
           <w:sz w:val="22"/>
           <w:szCs w:val="22"/>
         </w:rPr>
-        <w:t xml:space="preserve">  • Didžiosios ir mažosios raidės</w:t>
-      </w:r>
-    </w:p>
-    <w:p>
-      <w:pPr>
-        <w:spacing w:after="80"/>
+        <w:t xml:space="preserve">• Simbolių įvairovė: didžiosios, mažosios raidės, skaičiai, specialieji simboliai.</w:t>
+      </w:r>
+    </w:p>
+    <w:p>
+      <w:pPr>
+        <w:spacing w:after="40"/>
         <w:ind w:left="360"/>
       </w:pPr>
       <w:r>
@@ -843,7 +852,7 @@
           <w:sz w:val="22"/>
           <w:szCs w:val="22"/>
         </w:rPr>
-        <w:t xml:space="preserve">  • Skaičiai ir specialūs simboliai</w:t>
+        <w:t xml:space="preserve">• Ne asmeninė informacija: ne vardas, ne gimimo data, ne augintinio pavadinimas.</w:t>
       </w:r>
     </w:p>
     <w:p>
@@ -858,106 +867,21 @@
           <w:sz w:val="22"/>
           <w:szCs w:val="22"/>
         </w:rPr>
-        <w:t xml:space="preserve">  • Ne asmeninė informacija</w:t>
-      </w:r>
-    </w:p>
-    <w:p>
-      <w:pPr>
-        <w:spacing w:after="80"/>
-        <w:ind w:left="360"/>
-      </w:pPr>
-      <w:r>
-        <w:rPr>
-          <w:rFonts w:ascii="Arial" w:cs="Arial" w:eastAsia="Arial" w:hAnsi="Arial"/>
-          <w:color w:val="212121"/>
-          <w:sz w:val="22"/>
-          <w:szCs w:val="22"/>
-        </w:rPr>
-        <w:t xml:space="preserve">  • Kiekviena paskyra — skirtingas slaptažodis</w:t>
-      </w:r>
-    </w:p>
-    <w:p>
-      <w:pPr>
-        <w:spacing w:after="80"/>
-      </w:pPr>
-      <w:r>
-        <w:rPr>
-          <w:rFonts w:ascii="Arial" w:cs="Arial" w:eastAsia="Arial" w:hAnsi="Arial"/>
-          <w:b/>
-          <w:bCs/>
-          <w:color w:val="424242"/>
-          <w:sz w:val="22"/>
-          <w:szCs w:val="22"/>
-        </w:rPr>
-        <w:t xml:space="preserve">Supratimo patikrinimas: </w:t>
-      </w:r>
-      <w:r>
-        <w:rPr>
-          <w:rFonts w:ascii="Arial" w:cs="Arial" w:eastAsia="Arial" w:hAnsi="Arial"/>
-          <w:color w:val="212121"/>
-          <w:sz w:val="22"/>
-          <w:szCs w:val="22"/>
-        </w:rPr>
-        <w:t xml:space="preserve">„Ar slaptažodis 'Katinas2024!' yra stiprus? Kodėl taip arba ne?“</w:t>
-      </w:r>
-    </w:p>
-    <w:p>
-      <w:pPr>
-        <w:spacing w:after="80"/>
-      </w:pPr>
-      <w:r>
-        <w:rPr>
-          <w:rFonts w:ascii="Arial" w:cs="Arial" w:eastAsia="Arial" w:hAnsi="Arial"/>
-          <w:color w:val="212121"/>
-          <w:sz w:val="22"/>
-          <w:szCs w:val="22"/>
-        </w:rPr>
-        <w:t xml:space="preserve">Praktinis bandymas (~3 min.): Mokiniai sugalvoja stiprų slaptažodį pagal kriterijus (žodžiu, neįvedant į kompiuterį). 2–3 mokiniai pasidalina logika, ne pačiu slaptažodžiu.</w:t>
-      </w:r>
-    </w:p>
-    <w:p>
-      <w:pPr>
-        <w:keepNext/>
-        <w:spacing w:after="80"/>
-      </w:pPr>
-      <w:r>
-        <w:rPr>
-          <w:rFonts w:ascii="Arial" w:cs="Arial" w:eastAsia="Arial" w:hAnsi="Arial"/>
-          <w:b/>
-          <w:bCs/>
-          <w:color w:val="1565C0"/>
-          <w:sz w:val="22"/>
-          <w:szCs w:val="22"/>
-        </w:rPr>
-        <w:t xml:space="preserve">Dviejų veiksnių autentifikacija — ~7 min.</w:t>
-      </w:r>
-    </w:p>
-    <w:p>
-      <w:pPr>
-        <w:spacing w:after="80"/>
-      </w:pPr>
-      <w:r>
-        <w:rPr>
-          <w:rFonts w:ascii="Arial" w:cs="Arial" w:eastAsia="Arial" w:hAnsi="Arial"/>
-          <w:color w:val="212121"/>
-          <w:sz w:val="22"/>
-          <w:szCs w:val="22"/>
-        </w:rPr>
-        <w:t xml:space="preserve">Paaiškinkite 2FA logiką: kažkas, ką žinai (slaptažodis) + kažkas, ką turi (telefonas/kodas). Parodykite skaidrėje 2FA veikimo schemą.</w:t>
-      </w:r>
-    </w:p>
-    <w:p>
-      <w:pPr>
-        <w:spacing w:after="80"/>
-      </w:pPr>
-      <w:r>
-        <w:rPr>
-          <w:rFonts w:ascii="Arial" w:cs="Arial" w:eastAsia="Arial" w:hAnsi="Arial"/>
-          <w:color w:val="212121"/>
-          <w:sz w:val="22"/>
-          <w:szCs w:val="22"/>
-        </w:rPr>
-        <w:t xml:space="preserve">Paaiškinkite: net jei slaptažodis pavogtas, be antrojo veiksnio prisijungti nepavyks.</w:t>
+        <w:t xml:space="preserve">• Unikalumas: skirtingas slaptažodis kiekvienai paskyrai.</w:t>
+      </w:r>
+    </w:p>
+    <w:p>
+      <w:pPr>
+        <w:spacing w:after="80"/>
+      </w:pPr>
+      <w:r>
+        <w:rPr>
+          <w:rFonts w:ascii="Arial" w:cs="Arial" w:eastAsia="Arial" w:hAnsi="Arial"/>
+          <w:color w:val="212121"/>
+          <w:sz w:val="22"/>
+          <w:szCs w:val="22"/>
+        </w:rPr>
+        <w:t xml:space="preserve">Parodykite frazės tipo slaptažodžio kūrimo metodą: pasirenkate kelis nesusijusius žodžius ir sujungiate su skaičiais ar simboliais (pvz., „Stalas7!Debesis_Raudonas“). Paaiškinkite, kodėl frazė lengviau įsimenama, bet sunku atspėti.</w:t>
       </w:r>
     </w:p>
     <w:p>
@@ -985,19 +909,49 @@
           <w:sz w:val="22"/>
           <w:szCs w:val="22"/>
         </w:rPr>
-        <w:t xml:space="preserve">manyti, kad 2FA = dviejų slaptažodžių turėjimas. </w:t>
-      </w:r>
-      <w:r>
-        <w:rPr>
-          <w:rFonts w:ascii="Arial" w:cs="Arial" w:eastAsia="Arial" w:hAnsi="Arial"/>
-          <w:b/>
-          <w:bCs/>
-          <w:color w:val="212121"/>
-          <w:sz w:val="22"/>
-          <w:szCs w:val="22"/>
-        </w:rPr>
-        <w:t xml:space="preserve">Taisyklė: 2FA = du skirtingi veiksniai (žinojimas + turėjimas), ne du to paties tipo elementai.</w:t>
-      </w:r>
+        <w:t xml:space="preserve">mokiniai mano, kad slaptažodis „Vardas2010!“ yra stiprus, nes turi skaičius ir simbolį. </w:t>
+      </w:r>
+      <w:r>
+        <w:rPr>
+          <w:rFonts w:ascii="Arial" w:cs="Arial" w:eastAsia="Arial" w:hAnsi="Arial"/>
+          <w:b/>
+          <w:bCs/>
+          <w:color w:val="212121"/>
+          <w:sz w:val="22"/>
+          <w:szCs w:val="22"/>
+        </w:rPr>
+        <w:t xml:space="preserve">Taisyklė: jei slaptažodyje yra asmeninė informacija (vardas, gimimo metai), jis nesaugus, net jei turi simbolių.</w:t>
+      </w:r>
+    </w:p>
+    <w:p>
+      <w:pPr>
+        <w:spacing w:after="80"/>
+      </w:pPr>
+      <w:r>
+        <w:rPr>
+          <w:rFonts w:ascii="Arial" w:cs="Arial" w:eastAsia="Arial" w:hAnsi="Arial"/>
+          <w:b/>
+          <w:bCs/>
+          <w:color w:val="424242"/>
+          <w:sz w:val="22"/>
+          <w:szCs w:val="22"/>
+        </w:rPr>
+        <w:t xml:space="preserve">Mokinių veiksmai: </w:t>
+      </w:r>
+      <w:r>
+        <w:rPr>
+          <w:rFonts w:ascii="Arial" w:cs="Arial" w:eastAsia="Arial" w:hAnsi="Arial"/>
+          <w:color w:val="212121"/>
+          <w:sz w:val="22"/>
+          <w:szCs w:val="22"/>
+        </w:rPr>
+        <w:t xml:space="preserve">klauso, atsako į pradinį klausimą apie slaptažodžius, stebi pavyzdžius skaidrėje.</w:t>
+      </w:r>
+    </w:p>
+    <w:p>
+      <w:pPr>
+        <w:spacing w:before="120"/>
+      </w:pPr>
     </w:p>
     <w:p>
       <w:pPr>
@@ -1009,50 +963,308 @@
           <w:rFonts w:ascii="Arial" w:cs="Arial" w:eastAsia="Arial" w:hAnsi="Arial"/>
           <w:b/>
           <w:bCs/>
-          <w:color w:val="1565C0"/>
-          <w:sz w:val="22"/>
-          <w:szCs w:val="22"/>
-        </w:rPr>
-        <w:t xml:space="preserve">Jautrūs asmeniniai duomenys — ~5 min.</w:t>
-      </w:r>
-    </w:p>
-    <w:p>
-      <w:pPr>
-        <w:spacing w:after="80"/>
-      </w:pPr>
-      <w:r>
-        <w:rPr>
-          <w:rFonts w:ascii="Arial" w:cs="Arial" w:eastAsia="Arial" w:hAnsi="Arial"/>
-          <w:color w:val="212121"/>
-          <w:sz w:val="22"/>
-          <w:szCs w:val="22"/>
-        </w:rPr>
-        <w:t xml:space="preserve">Paaiškinkite: ne visi duomenys vienodai jautrūs. Parodykite pavyzdžių skalę: vardas (mažai jautrus) → adresas → asmens kodas → banko duomenys (labai jautrus).</w:t>
-      </w:r>
-    </w:p>
-    <w:p>
-      <w:pPr>
-        <w:spacing w:after="80"/>
-      </w:pPr>
-      <w:r>
-        <w:rPr>
-          <w:rFonts w:ascii="Arial" w:cs="Arial" w:eastAsia="Arial" w:hAnsi="Arial"/>
-          <w:b/>
-          <w:bCs/>
           <w:color w:val="424242"/>
           <w:sz w:val="22"/>
           <w:szCs w:val="22"/>
         </w:rPr>
-        <w:t xml:space="preserve">Supratimo patikrinimas: </w:t>
-      </w:r>
-      <w:r>
-        <w:rPr>
-          <w:rFonts w:ascii="Arial" w:cs="Arial" w:eastAsia="Arial" w:hAnsi="Arial"/>
-          <w:color w:val="212121"/>
-          <w:sz w:val="22"/>
-          <w:szCs w:val="22"/>
-        </w:rPr>
-        <w:t xml:space="preserve">„Ar savo mokyklos pavadinimą galima skelbti viešai? O namų adresą?“</w:t>
+        <w:t xml:space="preserve">Dėstymo blokas 2: </w:t>
+      </w:r>
+      <w:r>
+        <w:rPr>
+          <w:rFonts w:ascii="Arial" w:cs="Arial" w:eastAsia="Arial" w:hAnsi="Arial"/>
+          <w:color w:val="212121"/>
+          <w:sz w:val="22"/>
+          <w:szCs w:val="22"/>
+        </w:rPr>
+        <w:t xml:space="preserve">Dviejų veiksnių autentifikacija (~7 min.)</w:t>
+      </w:r>
+    </w:p>
+    <w:p>
+      <w:pPr>
+        <w:spacing w:after="80"/>
+      </w:pPr>
+      <w:r>
+        <w:rPr>
+          <w:rFonts w:ascii="Arial" w:cs="Arial" w:eastAsia="Arial" w:hAnsi="Arial"/>
+          <w:b/>
+          <w:bCs/>
+          <w:color w:val="424242"/>
+          <w:sz w:val="22"/>
+          <w:szCs w:val="22"/>
+        </w:rPr>
+        <w:t xml:space="preserve">Mokytojo veiksmai: </w:t>
+      </w:r>
+      <w:r>
+        <w:rPr>
+          <w:rFonts w:ascii="Arial" w:cs="Arial" w:eastAsia="Arial" w:hAnsi="Arial"/>
+          <w:color w:val="212121"/>
+          <w:sz w:val="22"/>
+          <w:szCs w:val="22"/>
+        </w:rPr>
+        <w:t xml:space="preserve">Paklauskite: kas nutiktų, jei kažkas sužinotų jūsų slaptažodį? Paaiškinkite, kad slaptažodis vienas negarantuoja saugumo. Pristatykite dviejų veiksnių autentifikacijos (2FA) logiką:</w:t>
+      </w:r>
+    </w:p>
+    <w:p>
+      <w:pPr>
+        <w:spacing w:after="40"/>
+        <w:ind w:left="360"/>
+      </w:pPr>
+      <w:r>
+        <w:rPr>
+          <w:rFonts w:ascii="Arial" w:cs="Arial" w:eastAsia="Arial" w:hAnsi="Arial"/>
+          <w:color w:val="212121"/>
+          <w:sz w:val="22"/>
+          <w:szCs w:val="22"/>
+        </w:rPr>
+        <w:t xml:space="preserve">• Pirmas veiksnys: tai, ką žinai (slaptažodis).</w:t>
+      </w:r>
+    </w:p>
+    <w:p>
+      <w:pPr>
+        <w:spacing w:after="40"/>
+        <w:ind w:left="360"/>
+      </w:pPr>
+      <w:r>
+        <w:rPr>
+          <w:rFonts w:ascii="Arial" w:cs="Arial" w:eastAsia="Arial" w:hAnsi="Arial"/>
+          <w:color w:val="212121"/>
+          <w:sz w:val="22"/>
+          <w:szCs w:val="22"/>
+        </w:rPr>
+        <w:t xml:space="preserve">• Antras veiksnys: tai, ką turi (telefonas, raktas) arba tai, kas esi (piršto antspaudas).</w:t>
+      </w:r>
+    </w:p>
+    <w:p>
+      <w:pPr>
+        <w:spacing w:after="80"/>
+        <w:ind w:left="360"/>
+      </w:pPr>
+      <w:r>
+        <w:rPr>
+          <w:rFonts w:ascii="Arial" w:cs="Arial" w:eastAsia="Arial" w:hAnsi="Arial"/>
+          <w:color w:val="212121"/>
+          <w:sz w:val="22"/>
+          <w:szCs w:val="22"/>
+        </w:rPr>
+        <w:t xml:space="preserve">• Net pavogus slaptažodį, be antrojo veiksnio prisijungti neįmanoma.</w:t>
+      </w:r>
+    </w:p>
+    <w:p>
+      <w:pPr>
+        <w:spacing w:after="80"/>
+      </w:pPr>
+      <w:r>
+        <w:rPr>
+          <w:rFonts w:ascii="Arial" w:cs="Arial" w:eastAsia="Arial" w:hAnsi="Arial"/>
+          <w:color w:val="212121"/>
+          <w:sz w:val="22"/>
+          <w:szCs w:val="22"/>
+        </w:rPr>
+        <w:t xml:space="preserve">Pateikite kasdienį palyginimą: durų užraktas (slaptažodis) + signalizacijos kodas (2FA). Net atidarius duris, signalizacija suveikia.</w:t>
+      </w:r>
+    </w:p>
+    <w:p>
+      <w:pPr>
+        <w:spacing w:after="80"/>
+      </w:pPr>
+      <w:r>
+        <w:rPr>
+          <w:rFonts w:ascii="Arial" w:cs="Arial" w:eastAsia="Arial" w:hAnsi="Arial"/>
+          <w:b/>
+          <w:bCs/>
+          <w:color w:val="424242"/>
+          <w:sz w:val="22"/>
+          <w:szCs w:val="22"/>
+        </w:rPr>
+        <w:t xml:space="preserve">Mokinių veiksmai: </w:t>
+      </w:r>
+      <w:r>
+        <w:rPr>
+          <w:rFonts w:ascii="Arial" w:cs="Arial" w:eastAsia="Arial" w:hAnsi="Arial"/>
+          <w:color w:val="212121"/>
+          <w:sz w:val="22"/>
+          <w:szCs w:val="22"/>
+        </w:rPr>
+        <w:t xml:space="preserve">klauso, atsako į klausimą apie slaptažodžio pažeidžiamumą, stebi 2FA schemą skaidrėje.</w:t>
+      </w:r>
+    </w:p>
+    <w:p>
+      <w:pPr>
+        <w:spacing w:before="120"/>
+      </w:pPr>
+    </w:p>
+    <w:p>
+      <w:pPr>
+        <w:keepNext/>
+        <w:spacing w:after="80"/>
+      </w:pPr>
+      <w:r>
+        <w:rPr>
+          <w:rFonts w:ascii="Arial" w:cs="Arial" w:eastAsia="Arial" w:hAnsi="Arial"/>
+          <w:b/>
+          <w:bCs/>
+          <w:color w:val="424242"/>
+          <w:sz w:val="22"/>
+          <w:szCs w:val="22"/>
+        </w:rPr>
+        <w:t xml:space="preserve">Dėstymo blokas 3: </w:t>
+      </w:r>
+      <w:r>
+        <w:rPr>
+          <w:rFonts w:ascii="Arial" w:cs="Arial" w:eastAsia="Arial" w:hAnsi="Arial"/>
+          <w:color w:val="212121"/>
+          <w:sz w:val="22"/>
+          <w:szCs w:val="22"/>
+        </w:rPr>
+        <w:t xml:space="preserve">Jautrių asmeninių duomenų atpažinimas (~7 min.)</w:t>
+      </w:r>
+    </w:p>
+    <w:p>
+      <w:pPr>
+        <w:spacing w:after="80"/>
+      </w:pPr>
+      <w:r>
+        <w:rPr>
+          <w:rFonts w:ascii="Arial" w:cs="Arial" w:eastAsia="Arial" w:hAnsi="Arial"/>
+          <w:b/>
+          <w:bCs/>
+          <w:color w:val="424242"/>
+          <w:sz w:val="22"/>
+          <w:szCs w:val="22"/>
+        </w:rPr>
+        <w:t xml:space="preserve">Mokytojo veiksmai: </w:t>
+      </w:r>
+      <w:r>
+        <w:rPr>
+          <w:rFonts w:ascii="Arial" w:cs="Arial" w:eastAsia="Arial" w:hAnsi="Arial"/>
+          <w:color w:val="212121"/>
+          <w:sz w:val="22"/>
+          <w:szCs w:val="22"/>
+        </w:rPr>
+        <w:t xml:space="preserve">Paklauskite: kokią informaciją apie save skelbiate internete? Surinkite pavyzdžius. Paaiškinkite, kad duomenys skirstomi pagal jautrumą:</w:t>
+      </w:r>
+    </w:p>
+    <w:p>
+      <w:pPr>
+        <w:spacing w:after="40"/>
+        <w:ind w:left="360"/>
+      </w:pPr>
+      <w:r>
+        <w:rPr>
+          <w:rFonts w:ascii="Arial" w:cs="Arial" w:eastAsia="Arial" w:hAnsi="Arial"/>
+          <w:color w:val="212121"/>
+          <w:sz w:val="22"/>
+          <w:szCs w:val="22"/>
+        </w:rPr>
+        <w:t xml:space="preserve">• Jautrūs duomenys: asmens kodas, namų adresas, slaptažodis, banko kortelės numeris.</w:t>
+      </w:r>
+    </w:p>
+    <w:p>
+      <w:pPr>
+        <w:spacing w:after="40"/>
+        <w:ind w:left="360"/>
+      </w:pPr>
+      <w:r>
+        <w:rPr>
+          <w:rFonts w:ascii="Arial" w:cs="Arial" w:eastAsia="Arial" w:hAnsi="Arial"/>
+          <w:color w:val="212121"/>
+          <w:sz w:val="22"/>
+          <w:szCs w:val="22"/>
+        </w:rPr>
+        <w:t xml:space="preserve">• Vidutinio jautrumo: el. pašto adresas, telefono numeris, mokyklos pavadinimas.</w:t>
+      </w:r>
+    </w:p>
+    <w:p>
+      <w:pPr>
+        <w:spacing w:after="80"/>
+        <w:ind w:left="360"/>
+      </w:pPr>
+      <w:r>
+        <w:rPr>
+          <w:rFonts w:ascii="Arial" w:cs="Arial" w:eastAsia="Arial" w:hAnsi="Arial"/>
+          <w:color w:val="212121"/>
+          <w:sz w:val="22"/>
+          <w:szCs w:val="22"/>
+        </w:rPr>
+        <w:t xml:space="preserve">• Vieša informacija: pomėgiai, mėgstamas sportas, mėgstama muzika.</w:t>
+      </w:r>
+    </w:p>
+    <w:p>
+      <w:pPr>
+        <w:spacing w:after="80"/>
+      </w:pPr>
+      <w:r>
+        <w:rPr>
+          <w:rFonts w:ascii="Arial" w:cs="Arial" w:eastAsia="Arial" w:hAnsi="Arial"/>
+          <w:color w:val="212121"/>
+          <w:sz w:val="22"/>
+          <w:szCs w:val="22"/>
+        </w:rPr>
+        <w:t xml:space="preserve">Parodykite skaidrėje 2–3 konkrečias situacijas. Pvz.: „Draugas prašo atsiųsti asmens kodą per žinutę, kad užregistruotų jus į konkursą.“ Paklauskite: ar tai saugu? Kodėl? Pateikite argumentuotą atsakymą.</w:t>
+      </w:r>
+    </w:p>
+    <w:p>
+      <w:pPr>
+        <w:keepLines/>
+        <w:shd w:fill="FFF8E1" w:val="clear"/>
+        <w:spacing w:after="80" w:before="80"/>
+        <w:ind w:left="240"/>
+      </w:pPr>
+      <w:r>
+        <w:rPr>
+          <w:rFonts w:ascii="Arial" w:cs="Arial" w:eastAsia="Arial" w:hAnsi="Arial"/>
+          <w:b/>
+          <w:bCs/>
+          <w:color w:val="E65100"/>
+          <w:sz w:val="22"/>
+          <w:szCs w:val="22"/>
+        </w:rPr>
+        <w:t xml:space="preserve">⚠ Dažna klaida: </w:t>
+      </w:r>
+      <w:r>
+        <w:rPr>
+          <w:rFonts w:ascii="Arial" w:cs="Arial" w:eastAsia="Arial" w:hAnsi="Arial"/>
+          <w:color w:val="212121"/>
+          <w:sz w:val="22"/>
+          <w:szCs w:val="22"/>
+        </w:rPr>
+        <w:t xml:space="preserve">mokiniai mano, kad el. pašto adresas yra visiškai nepavojinga informacija. </w:t>
+      </w:r>
+      <w:r>
+        <w:rPr>
+          <w:rFonts w:ascii="Arial" w:cs="Arial" w:eastAsia="Arial" w:hAnsi="Arial"/>
+          <w:b/>
+          <w:bCs/>
+          <w:color w:val="212121"/>
+          <w:sz w:val="22"/>
+          <w:szCs w:val="22"/>
+        </w:rPr>
+        <w:t xml:space="preserve">Taisyklė: el. pašto adresas gali būti naudojamas slaptažodžio atkūrimui, todėl jo nereikėtų skelbti viešai.</w:t>
+      </w:r>
+    </w:p>
+    <w:p>
+      <w:pPr>
+        <w:spacing w:after="80"/>
+      </w:pPr>
+      <w:r>
+        <w:rPr>
+          <w:rFonts w:ascii="Arial" w:cs="Arial" w:eastAsia="Arial" w:hAnsi="Arial"/>
+          <w:b/>
+          <w:bCs/>
+          <w:color w:val="424242"/>
+          <w:sz w:val="22"/>
+          <w:szCs w:val="22"/>
+        </w:rPr>
+        <w:t xml:space="preserve">Mokinių veiksmai: </w:t>
+      </w:r>
+      <w:r>
+        <w:rPr>
+          <w:rFonts w:ascii="Arial" w:cs="Arial" w:eastAsia="Arial" w:hAnsi="Arial"/>
+          <w:color w:val="212121"/>
+          <w:sz w:val="22"/>
+          <w:szCs w:val="22"/>
+        </w:rPr>
+        <w:t xml:space="preserve">vardija savo skelbiamą informaciją, vertina situacijas skaidrėje, argumentuoja, ar elgesys saugus.</w:t>
       </w:r>
     </w:p>
     <w:p>
@@ -1064,10 +1276,10 @@
       <w:tblPr>
         <w:tblW w:type="auto" w:w="100"/>
         <w:tblBorders>
-          <w:top w:val="none" w:color="FFFFFF" w:sz="0"/>
-          <w:left w:val="none" w:color="FFFFFF" w:sz="0"/>
-          <w:bottom w:val="none" w:color="FFFFFF" w:sz="0"/>
-          <w:right w:val="none" w:color="FFFFFF" w:sz="0"/>
+          <w:top w:val="none" w:sz="0"/>
+          <w:left w:val="none" w:sz="0"/>
+          <w:bottom w:val="none" w:sz="0"/>
+          <w:right w:val="none" w:sz="0"/>
           <w:insideH w:val="single" w:color="auto" w:sz="4"/>
           <w:insideV w:val="single" w:color="auto" w:sz="4"/>
         </w:tblBorders>
@@ -1084,6 +1296,12 @@
         <w:tc>
           <w:tcPr>
             <w:tcW w:type="dxa" w:w="200"/>
+            <w:tcBorders>
+              <w:top w:val="none" w:sz="0"/>
+              <w:left w:val="none" w:sz="0"/>
+              <w:bottom w:val="none" w:sz="0"/>
+              <w:right w:val="none" w:sz="0"/>
+            </w:tcBorders>
             <w:shd w:fill="2E7D32" w:val="clear"/>
           </w:tcPr>
           <w:p/>
@@ -1091,6 +1309,12 @@
         <w:tc>
           <w:tcPr>
             <w:tcW w:type="dxa" w:w="9400"/>
+            <w:tcBorders>
+              <w:top w:val="none" w:sz="0"/>
+              <w:left w:val="none" w:sz="0"/>
+              <w:bottom w:val="none" w:sz="0"/>
+              <w:right w:val="none" w:sz="0"/>
+            </w:tcBorders>
             <w:shd w:fill="E8F5E9" w:val="clear"/>
           </w:tcPr>
           <w:p>
@@ -1103,7 +1327,7 @@
                 <w:sz w:val="24"/>
                 <w:szCs w:val="24"/>
               </w:rPr>
-              <w:t xml:space="preserve">Savarankišk a užduotis</w:t>
+              <w:t xml:space="preserve">Savarankiška užduotis</w:t>
             </w:r>
             <w:r>
               <w:rPr>
@@ -1120,23 +1344,59 @@
     </w:tbl>
     <w:p>
       <w:pPr>
+        <w:spacing w:after="80"/>
+      </w:pPr>
+      <w:r>
+        <w:rPr>
+          <w:rFonts w:ascii="Arial" w:cs="Arial" w:eastAsia="Arial" w:hAnsi="Arial"/>
+          <w:b/>
+          <w:bCs/>
+          <w:color w:val="424242"/>
+          <w:sz w:val="22"/>
+          <w:szCs w:val="22"/>
+        </w:rPr>
+        <w:t xml:space="preserve">Mokytojo veiksmai: </w:t>
+      </w:r>
+      <w:r>
+        <w:rPr>
+          <w:rFonts w:ascii="Arial" w:cs="Arial" w:eastAsia="Arial" w:hAnsi="Arial"/>
+          <w:color w:val="212121"/>
+          <w:sz w:val="22"/>
+          <w:szCs w:val="22"/>
+        </w:rPr>
+        <w:t xml:space="preserve">Perskaitykite kiekvieną situaciją garsiai. Po kiekvienos situacijos paklauskite kelių mokinių pasirinktinai: saugu ar nesaugu? Reikalaukite argumentavimo, ne tik atsakymo „taip“ arba „ne“.</w:t>
+      </w:r>
+    </w:p>
+    <w:p>
+      <w:pPr>
         <w:keepNext/>
         <w:spacing w:after="80"/>
       </w:pPr>
       <w:r>
         <w:rPr>
           <w:rFonts w:ascii="Arial" w:cs="Arial" w:eastAsia="Arial" w:hAnsi="Arial"/>
-          <w:color w:val="212121"/>
-          <w:sz w:val="22"/>
-          <w:szCs w:val="22"/>
-        </w:rPr>
-        <w:t xml:space="preserve">Užduoties instrukcijos skaidrėje. Mokytojas perskaito 5 situacijas. Mokiniai žodžiu atsakinėja: saugu ar nesaugu? Kodėl?</w:t>
-      </w:r>
-    </w:p>
-    <w:p>
-      <w:pPr>
-        <w:keepNext/>
-        <w:spacing w:after="80"/>
+          <w:b/>
+          <w:bCs/>
+          <w:color w:val="424242"/>
+          <w:sz w:val="22"/>
+          <w:szCs w:val="22"/>
+        </w:rPr>
+        <w:t xml:space="preserve">Užduotis: </w:t>
+      </w:r>
+      <w:r>
+        <w:rPr>
+          <w:rFonts w:ascii="Arial" w:cs="Arial" w:eastAsia="Arial" w:hAnsi="Arial"/>
+          <w:color w:val="212121"/>
+          <w:sz w:val="22"/>
+          <w:szCs w:val="22"/>
+        </w:rPr>
+        <w:t xml:space="preserve">5 situacijos. Kiekvienai nurodykite: saugu ar nesaugu? Pagrįskite savo atsakymą.</w:t>
+      </w:r>
+    </w:p>
+    <w:p>
+      <w:pPr>
+        <w:spacing w:after="60"/>
+        <w:ind w:left="360"/>
       </w:pPr>
       <w:r>
         <w:rPr>
@@ -1147,52 +1407,94 @@
           <w:sz w:val="22"/>
           <w:szCs w:val="22"/>
         </w:rPr>
-        <w:t xml:space="preserve">Situacijos:</w:t>
-      </w:r>
-    </w:p>
-    <w:p>
-      <w:pPr>
-        <w:spacing w:after="80"/>
+        <w:t xml:space="preserve">1. </w:t>
+      </w:r>
+      <w:r>
+        <w:rPr>
+          <w:rFonts w:ascii="Arial" w:cs="Arial" w:eastAsia="Arial" w:hAnsi="Arial"/>
+          <w:color w:val="212121"/>
+          <w:sz w:val="22"/>
+          <w:szCs w:val="22"/>
+        </w:rPr>
+        <w:t xml:space="preserve">Naudojate tą patį slaptažodį visoms savo paskyroms, nes jis ilgas ir sudėtingas.</w:t>
+      </w:r>
+    </w:p>
+    <w:p>
+      <w:pPr>
+        <w:spacing w:after="60"/>
         <w:ind w:left="360"/>
       </w:pPr>
       <w:r>
         <w:rPr>
           <w:rFonts w:ascii="Arial" w:cs="Arial" w:eastAsia="Arial" w:hAnsi="Arial"/>
-          <w:color w:val="212121"/>
-          <w:sz w:val="22"/>
-          <w:szCs w:val="22"/>
-        </w:rPr>
-        <w:t xml:space="preserve">1. Draugas prašo pasidalinti „Netflix“ slaptažodžiu.</w:t>
-      </w:r>
-    </w:p>
-    <w:p>
-      <w:pPr>
-        <w:spacing w:after="80"/>
+          <w:b/>
+          <w:bCs/>
+          <w:color w:val="2E7D32"/>
+          <w:sz w:val="22"/>
+          <w:szCs w:val="22"/>
+        </w:rPr>
+        <w:t xml:space="preserve">2. </w:t>
+      </w:r>
+      <w:r>
+        <w:rPr>
+          <w:rFonts w:ascii="Arial" w:cs="Arial" w:eastAsia="Arial" w:hAnsi="Arial"/>
+          <w:color w:val="212121"/>
+          <w:sz w:val="22"/>
+          <w:szCs w:val="22"/>
+        </w:rPr>
+        <w:t xml:space="preserve">Nepažįstamas asmuo socialiniame tinkle prašo jūsų telefono numerio, kad galėtų atsiųsti dovanų kodą.</w:t>
+      </w:r>
+    </w:p>
+    <w:p>
+      <w:pPr>
+        <w:spacing w:after="60"/>
         <w:ind w:left="360"/>
       </w:pPr>
       <w:r>
         <w:rPr>
           <w:rFonts w:ascii="Arial" w:cs="Arial" w:eastAsia="Arial" w:hAnsi="Arial"/>
-          <w:color w:val="212121"/>
-          <w:sz w:val="22"/>
-          <w:szCs w:val="22"/>
-        </w:rPr>
-        <w:t xml:space="preserve">2. Svetainė prašo gimimo datos registruojantis žaidimui.</w:t>
-      </w:r>
-    </w:p>
-    <w:p>
-      <w:pPr>
-        <w:spacing w:after="80"/>
+          <w:b/>
+          <w:bCs/>
+          <w:color w:val="2E7D32"/>
+          <w:sz w:val="22"/>
+          <w:szCs w:val="22"/>
+        </w:rPr>
+        <w:t xml:space="preserve">3. </w:t>
+      </w:r>
+      <w:r>
+        <w:rPr>
+          <w:rFonts w:ascii="Arial" w:cs="Arial" w:eastAsia="Arial" w:hAnsi="Arial"/>
+          <w:color w:val="212121"/>
+          <w:sz w:val="22"/>
+          <w:szCs w:val="22"/>
+        </w:rPr>
+        <w:t xml:space="preserve">Įjungiate dviejų veiksnių autentifikaciją savo el. pašto paskyroje.</w:t>
+      </w:r>
+    </w:p>
+    <w:p>
+      <w:pPr>
+        <w:spacing w:after="60"/>
         <w:ind w:left="360"/>
       </w:pPr>
       <w:r>
         <w:rPr>
           <w:rFonts w:ascii="Arial" w:cs="Arial" w:eastAsia="Arial" w:hAnsi="Arial"/>
-          <w:color w:val="212121"/>
-          <w:sz w:val="22"/>
-          <w:szCs w:val="22"/>
-        </w:rPr>
-        <w:t xml:space="preserve">3. Nepažįstamas asmuo socialiniame tinkle klausia, kurioje mokykloje mokaisi.</w:t>
+          <w:b/>
+          <w:bCs/>
+          <w:color w:val="2E7D32"/>
+          <w:sz w:val="22"/>
+          <w:szCs w:val="22"/>
+        </w:rPr>
+        <w:t xml:space="preserve">4. </w:t>
+      </w:r>
+      <w:r>
+        <w:rPr>
+          <w:rFonts w:ascii="Arial" w:cs="Arial" w:eastAsia="Arial" w:hAnsi="Arial"/>
+          <w:color w:val="212121"/>
+          <w:sz w:val="22"/>
+          <w:szCs w:val="22"/>
+        </w:rPr>
+        <w:t xml:space="preserve">Draugas klasėje prašo pasakyti jūsų slaptažodį, kad patikrintų, ar paskyra veikia.</w:t>
       </w:r>
     </w:p>
     <w:p>
@@ -1203,40 +1505,72 @@
       <w:r>
         <w:rPr>
           <w:rFonts w:ascii="Arial" w:cs="Arial" w:eastAsia="Arial" w:hAnsi="Arial"/>
-          <w:color w:val="212121"/>
-          <w:sz w:val="22"/>
-          <w:szCs w:val="22"/>
-        </w:rPr>
-        <w:t xml:space="preserve">4. El. parduotuvė prašo namų adreso pristatymui.</w:t>
-      </w:r>
-    </w:p>
-    <w:p>
-      <w:pPr>
-        <w:spacing w:after="80"/>
-        <w:ind w:left="360"/>
-      </w:pPr>
-      <w:r>
-        <w:rPr>
-          <w:rFonts w:ascii="Arial" w:cs="Arial" w:eastAsia="Arial" w:hAnsi="Arial"/>
-          <w:color w:val="212121"/>
-          <w:sz w:val="22"/>
-          <w:szCs w:val="22"/>
-        </w:rPr>
-        <w:t xml:space="preserve">5. Klasiokas sako: „Duok savo slaptažodį, aš tik pažiūrėsiu.“</w:t>
-      </w:r>
-    </w:p>
-    <w:p>
-      <w:pPr>
-        <w:spacing w:after="80"/>
-      </w:pPr>
-      <w:r>
-        <w:rPr>
-          <w:rFonts w:ascii="Arial" w:cs="Arial" w:eastAsia="Arial" w:hAnsi="Arial"/>
-          <w:color w:val="212121"/>
-          <w:sz w:val="22"/>
-          <w:szCs w:val="22"/>
-        </w:rPr>
-        <w:t xml:space="preserve">Po kiekvienos situacijos trumpai aptarkite teisingą atsakymą.</w:t>
+          <w:b/>
+          <w:bCs/>
+          <w:color w:val="2E7D32"/>
+          <w:sz w:val="22"/>
+          <w:szCs w:val="22"/>
+        </w:rPr>
+        <w:t xml:space="preserve">5. </w:t>
+      </w:r>
+      <w:r>
+        <w:rPr>
+          <w:rFonts w:ascii="Arial" w:cs="Arial" w:eastAsia="Arial" w:hAnsi="Arial"/>
+          <w:color w:val="212121"/>
+          <w:sz w:val="22"/>
+          <w:szCs w:val="22"/>
+        </w:rPr>
+        <w:t xml:space="preserve">Užsiregistruojate naujoje svetainėje ir ji prašo nurodyti namų adresą, nors tai yra žaidimų forumas.</w:t>
+      </w:r>
+    </w:p>
+    <w:p>
+      <w:pPr>
+        <w:spacing w:after="80"/>
+      </w:pPr>
+      <w:r>
+        <w:rPr>
+          <w:rFonts w:ascii="Arial" w:cs="Arial" w:eastAsia="Arial" w:hAnsi="Arial"/>
+          <w:b/>
+          <w:bCs/>
+          <w:color w:val="424242"/>
+          <w:sz w:val="22"/>
+          <w:szCs w:val="22"/>
+        </w:rPr>
+        <w:t xml:space="preserve">Mokinių veiksmai: </w:t>
+      </w:r>
+      <w:r>
+        <w:rPr>
+          <w:rFonts w:ascii="Arial" w:cs="Arial" w:eastAsia="Arial" w:hAnsi="Arial"/>
+          <w:color w:val="212121"/>
+          <w:sz w:val="22"/>
+          <w:szCs w:val="22"/>
+        </w:rPr>
+        <w:t xml:space="preserve">klauso situacijų, žodžiu atsako, ar elgesys saugus, ir pagrindžia savo nuomonę. Jei atsakymas neteisingas arba nepilnas, kiti mokiniai papildo.</w:t>
+      </w:r>
+    </w:p>
+    <w:p>
+      <w:pPr>
+        <w:spacing w:after="80"/>
+      </w:pPr>
+      <w:r>
+        <w:rPr>
+          <w:rFonts w:ascii="Arial" w:cs="Arial" w:eastAsia="Arial" w:hAnsi="Arial"/>
+          <w:b/>
+          <w:bCs/>
+          <w:color w:val="424242"/>
+          <w:sz w:val="22"/>
+          <w:szCs w:val="22"/>
+        </w:rPr>
+        <w:t xml:space="preserve">Ką stebėti: </w:t>
+      </w:r>
+      <w:r>
+        <w:rPr>
+          <w:rFonts w:ascii="Arial" w:cs="Arial" w:eastAsia="Arial" w:hAnsi="Arial"/>
+          <w:color w:val="212121"/>
+          <w:sz w:val="22"/>
+          <w:szCs w:val="22"/>
+        </w:rPr>
+        <w:t xml:space="preserve">ar mokiniai tik atsako „saugu / nesaugu“, ar pateikia argumentą. Jei argumentavimas silpnas, padėkite nukreipiančiu klausimu: „O kodėl tai pavojinga? Kas galėtų nutikti?“</w:t>
       </w:r>
     </w:p>
     <w:p>
@@ -1248,10 +1582,10 @@
       <w:tblPr>
         <w:tblW w:type="auto" w:w="100"/>
         <w:tblBorders>
-          <w:top w:val="none" w:color="FFFFFF" w:sz="0"/>
-          <w:left w:val="none" w:color="FFFFFF" w:sz="0"/>
-          <w:bottom w:val="none" w:color="FFFFFF" w:sz="0"/>
-          <w:right w:val="none" w:color="FFFFFF" w:sz="0"/>
+          <w:top w:val="none" w:sz="0"/>
+          <w:left w:val="none" w:sz="0"/>
+          <w:bottom w:val="none" w:sz="0"/>
+          <w:right w:val="none" w:sz="0"/>
           <w:insideH w:val="single" w:color="auto" w:sz="4"/>
           <w:insideV w:val="single" w:color="auto" w:sz="4"/>
         </w:tblBorders>
@@ -1268,6 +1602,12 @@
         <w:tc>
           <w:tcPr>
             <w:tcW w:type="dxa" w:w="200"/>
+            <w:tcBorders>
+              <w:top w:val="none" w:sz="0"/>
+              <w:left w:val="none" w:sz="0"/>
+              <w:bottom w:val="none" w:sz="0"/>
+              <w:right w:val="none" w:sz="0"/>
+            </w:tcBorders>
             <w:shd w:fill="F57C00" w:val="clear"/>
           </w:tcPr>
           <w:p/>
@@ -1275,6 +1615,12 @@
         <w:tc>
           <w:tcPr>
             <w:tcW w:type="dxa" w:w="9400"/>
+            <w:tcBorders>
+              <w:top w:val="none" w:sz="0"/>
+              <w:left w:val="none" w:sz="0"/>
+              <w:bottom w:val="none" w:sz="0"/>
+              <w:right w:val="none" w:sz="0"/>
+            </w:tcBorders>
             <w:shd w:fill="FFF3E0" w:val="clear"/>
           </w:tcPr>
           <w:p>
@@ -1325,12 +1671,11 @@
           <w:sz w:val="22"/>
           <w:szCs w:val="22"/>
         </w:rPr>
-        <w:t xml:space="preserve">žodinis. Klausimai skaidrėje.</w:t>
-      </w:r>
-    </w:p>
-    <w:p>
-      <w:pPr>
-        <w:keepNext/>
+        <w:t xml:space="preserve">žodinis, klausimai skaidrėje.</w:t>
+      </w:r>
+    </w:p>
+    <w:p>
+      <w:pPr>
         <w:spacing w:after="60"/>
         <w:ind w:left="360"/>
       </w:pPr>
@@ -1352,12 +1697,11 @@
           <w:sz w:val="22"/>
           <w:szCs w:val="22"/>
         </w:rPr>
-        <w:t xml:space="preserve">Kokie 3 kriterijai daro slaptažodį stiprų?</w:t>
-      </w:r>
-    </w:p>
-    <w:p>
-      <w:pPr>
-        <w:keepNext/>
+        <w:t xml:space="preserve">Įvardinkite tris stipraus slaptažodžio kriterijus.</w:t>
+      </w:r>
+    </w:p>
+    <w:p>
+      <w:pPr>
         <w:spacing w:after="60"/>
         <w:ind w:left="360"/>
       </w:pPr>
@@ -1379,12 +1723,11 @@
           <w:sz w:val="22"/>
           <w:szCs w:val="22"/>
         </w:rPr>
-        <w:t xml:space="preserve">Kodėl 2FA padeda, net jei slaptažodis pavogtas?</w:t>
-      </w:r>
-    </w:p>
-    <w:p>
-      <w:pPr>
-        <w:keepNext/>
+        <w:t xml:space="preserve">Kodėl 2FA apsaugo paskyrą net tada, kai slaptažodis pavogtas?</w:t>
+      </w:r>
+    </w:p>
+    <w:p>
+      <w:pPr>
         <w:spacing w:after="60"/>
         <w:ind w:left="360"/>
       </w:pPr>
@@ -1406,7 +1749,7 @@
           <w:sz w:val="22"/>
           <w:szCs w:val="22"/>
         </w:rPr>
-        <w:t xml:space="preserve">Ar savo vardą ir pavardę skelbti internete saugu? Nuo ko tai priklauso?</w:t>
+        <w:t xml:space="preserve">Jūsų draugas skelbia savo gimimo datą ir mokyklos pavadinimą socialiniame tinkle. Kuo tai gali būti pavojinga?</w:t>
       </w:r>
     </w:p>
     <w:p>
@@ -1420,7 +1763,7 @@
         <w:pBdr>
           <w:bottom w:val="single" w:color="757575" w:sz="8"/>
         </w:pBdr>
-        <w:spacing w:after="100"/>
+        <w:spacing w:after="120"/>
       </w:pPr>
     </w:p>
     <w:p>
@@ -1452,7 +1795,7 @@
           <w:sz w:val="21"/>
           <w:szCs w:val="21"/>
         </w:rPr>
-        <w:t xml:space="preserve">Pamokoje mokiniai nagrinėjo skaitmeninės paskyrų saugos pagrindus: stiprių slaptažodžių kūrimo kriterijus, dviejų veiksnių autentifikacijos veikimo principą ir jautrių asmeninių duomenų atpažinimą. Analizavo konkrečias situacijas ir vertino, ar elgesys su duomenimis yra saugus.</w:t>
+        <w:t xml:space="preserve">Pamokos metu mokiniai susipažino su paskyrų saugos pagrindais. Nagrinėjo stipraus slaptažodžio kriterijus: ilgį, simbolių įvairovę, unikalumą ir asmeninės informacijos vengimą. Suprato dviejų veiksnių autentifikacijos (2FA) veikimo principą ir kodėl antrasis veiksnys apsaugo paskyrą net praradus slaptažodį. Mokėsi atskirti jautrius asmeninius duomenis nuo viešos informacijos ir vertino konkrečias situacijas, argumentuodami, ar elgesys su duomenimis yra saugus.</w:t>
       </w:r>
     </w:p>
     <w:sectPr>

</xml_diff>